<commit_message>
Cambios realizados en documentos: Estandarizacion de formato RUt de Andrés, Correcion de nombre duncan a Dunkan, año de ingreso a carrera de Diego
</commit_message>
<xml_diff>
--- a/Fase 1/Evidencias Individuales/FERNANDEZ_ANDRES_1.3_APT122_AutoevaluacionFase1.docx
+++ b/Fase 1/Evidencias Individuales/FERNANDEZ_ANDRES_1.3_APT122_AutoevaluacionFase1.docx
@@ -224,7 +224,7 @@
           <w:szCs w:val="24"/>
           <w:lang w:val="es-CL"/>
         </w:rPr>
-        <w:t>15.417.074-k</w:t>
+        <w:t>15.417.074-K</w:t>
       </w:r>
     </w:p>
     <w:p>
@@ -2046,7 +2046,7 @@
           <w:szCs w:val="24"/>
           <w:lang w:val="es-CL"/>
         </w:rPr>
-        <w:t xml:space="preserve">, siendo el punto de contacto principal con el cliente; Duncan Hernández desarrolla el </w:t>
+        <w:t xml:space="preserve">, siendo el punto de contacto principal con el cliente; Dunkan Hernández desarrolla el </w:t>
       </w:r>
       <w:proofErr w:type="spellStart"/>
       <w:r>

</xml_diff>